<commit_message>
2.2.7-rasm namunasi: chiziqli diagramma + ma'lumotlar jadvali (Aloqabank bilan)
Co-Authored-By: Claude Opus 5.5 <noreply@anthropic.com>
Claude-Session: https://claude.ai/code/session_01PxHTC8Q7yHdrpAeUA5KUgM
</commit_message>
<xml_diff>
--- a/Namuna_2.2.7-rasm_Aloqabank.docx
+++ b/Namuna_2.2.7-rasm_Aloqabank.docx
@@ -15,7 +15,7 @@
         </w:rPr>
         <w:drawing>
           <wp:inline distT="0" distB="0" distL="0" distR="0">
-            <wp:extent cx="5760000" cy="2880000"/>
+            <wp:extent cx="5940000" cy="3960000"/>
             <wp:effectExtent l="0" t="0" r="0" b="0"/>
             <wp:docPr id="1001" name="2.2.7-rasm"/>
             <wp:cNvGraphicFramePr/>
@@ -48,7 +48,7 @@
           <w:i/>
           <w:sz w:val="22"/>
         </w:rPr>
-        <w:t>Namuna (ko‘rish uchun): 16×8 sm o‘lchamda 6 ta ustun – har bir yil uchun uch bankning ikki ko‘rsatkichi. Aloqabank ma’lumotlari: muallif hisob-kitobi (prudensial shakllar va MHXS hisobotlari).</w:t>
+        <w:t>Namuna (ko‘rish uchun): chiziqli diagramma va ostida ma’lumotlar jadvali; uzuq chiziq – rasmiy muammoli kreditlar, to‘liq chiziq – MHXS 9 bo‘yicha 3-bosqich kreditlari. Aloqabank ma’lumotlari: muallif hisob-kitobi (prudensial shakllar va MHXS hisobotlari).</w:t>
       </w:r>
     </w:p>
     <w:sectPr>
@@ -23920,10 +23920,19 @@
   <c:chart>
     <c:autoTitleDeleted val="1"/>
     <c:plotArea>
-      <c:layout/>
-      <c:barChart>
-        <c:barDir val="col"/>
-        <c:grouping val="clustered"/>
+      <c:layout>
+        <c:manualLayout>
+          <c:layoutTarget val="inner"/>
+          <c:xMode val="edge"/>
+          <c:yMode val="edge"/>
+          <c:x val="0.3"/>
+          <c:y val="0.03"/>
+          <c:w val="0.68"/>
+          <c:h val="0.5"/>
+        </c:manualLayout>
+      </c:layout>
+      <c:lineChart>
+        <c:grouping val="standard"/>
         <c:varyColors val="0"/>
         <c:ser>
           <c:idx val="0"/>
@@ -23934,54 +23943,31 @@
               <c:strCache>
                 <c:ptCount val="1"/>
                 <c:pt idx="0">
-                  <c:v>SQB: rasmiy muammoli kreditlar</c:v>
+                  <c:v>SQB: rasmiy muammoli</c:v>
                 </c:pt>
               </c:strCache>
             </c:strRef>
           </c:tx>
           <c:spPr>
-            <a:solidFill>
-              <a:srgbClr val="9DC3E6"/>
-            </a:solidFill>
-            <a:ln w="6350">
+            <a:ln w="28575">
               <a:solidFill>
-                <a:srgbClr val="FFFFFF"/>
+                <a:srgbClr val="5B9BD5"/>
               </a:solidFill>
+              <a:prstDash val="dash"/>
             </a:ln>
           </c:spPr>
-          <c:invertIfNegative val="0"/>
-          <c:dLbls>
-            <c:numFmt formatCode="0.0" sourceLinked="0"/>
+          <c:marker>
+            <c:symbol val="circle"/>
+            <c:size val="5"/>
             <c:spPr>
-              <a:noFill/>
+              <a:solidFill>
+                <a:srgbClr val="5B9BD5"/>
+              </a:solidFill>
               <a:ln>
                 <a:noFill/>
               </a:ln>
             </c:spPr>
-            <c:txPr>
-              <a:bodyPr/>
-              <a:lstStyle/>
-              <a:p>
-                <a:pPr>
-                  <a:defRPr sz="1050" b="1">
-                    <a:solidFill>
-                      <a:srgbClr val="000000"/>
-                    </a:solidFill>
-                    <a:latin typeface="Times New Roman"/>
-                    <a:cs typeface="Times New Roman"/>
-                  </a:defRPr>
-                </a:pPr>
-                <a:endParaRPr lang="uz-Latn-UZ"/>
-              </a:p>
-            </c:txPr>
-            <c:dLblPos val="outEnd"/>
-            <c:showLegendKey val="0"/>
-            <c:showVal val="1"/>
-            <c:showCatName val="0"/>
-            <c:showSerName val="0"/>
-            <c:showPercent val="0"/>
-            <c:showBubbleSize val="0"/>
-          </c:dLbls>
+          </c:marker>
           <c:cat>
             <c:strRef>
               <c:f>Sheet1!$A$2:$A$6</c:f>
@@ -24009,7 +23995,7 @@
             <c:numRef>
               <c:f>Sheet1!$B$2:$B$6</c:f>
               <c:numCache>
-                <c:formatCode>General</c:formatCode>
+                <c:formatCode>0.0</c:formatCode>
                 <c:ptCount val="5"/>
                 <c:pt idx="0">
                   <c:v>3.8</c:v>
@@ -24029,6 +24015,7 @@
               </c:numCache>
             </c:numRef>
           </c:val>
+          <c:smooth val="0"/>
         </c:ser>
         <c:ser>
           <c:idx val="1"/>
@@ -24039,54 +24026,30 @@
               <c:strCache>
                 <c:ptCount val="1"/>
                 <c:pt idx="0">
-                  <c:v>SQB: MHXS 9 bo‘yicha 3-bosqich</c:v>
+                  <c:v>SQB: 3-bosqich (MHXS)</c:v>
                 </c:pt>
               </c:strCache>
             </c:strRef>
           </c:tx>
           <c:spPr>
-            <a:solidFill>
-              <a:srgbClr val="2E75B6"/>
-            </a:solidFill>
-            <a:ln w="6350">
+            <a:ln w="28575">
               <a:solidFill>
-                <a:srgbClr val="FFFFFF"/>
+                <a:srgbClr val="1F4E79"/>
               </a:solidFill>
             </a:ln>
           </c:spPr>
-          <c:invertIfNegative val="0"/>
-          <c:dLbls>
-            <c:numFmt formatCode="0.0" sourceLinked="0"/>
+          <c:marker>
+            <c:symbol val="circle"/>
+            <c:size val="5"/>
             <c:spPr>
-              <a:noFill/>
+              <a:solidFill>
+                <a:srgbClr val="1F4E79"/>
+              </a:solidFill>
               <a:ln>
                 <a:noFill/>
               </a:ln>
             </c:spPr>
-            <c:txPr>
-              <a:bodyPr/>
-              <a:lstStyle/>
-              <a:p>
-                <a:pPr>
-                  <a:defRPr sz="1050" b="1">
-                    <a:solidFill>
-                      <a:srgbClr val="000000"/>
-                    </a:solidFill>
-                    <a:latin typeface="Times New Roman"/>
-                    <a:cs typeface="Times New Roman"/>
-                  </a:defRPr>
-                </a:pPr>
-                <a:endParaRPr lang="uz-Latn-UZ"/>
-              </a:p>
-            </c:txPr>
-            <c:dLblPos val="outEnd"/>
-            <c:showLegendKey val="0"/>
-            <c:showVal val="1"/>
-            <c:showCatName val="0"/>
-            <c:showSerName val="0"/>
-            <c:showPercent val="0"/>
-            <c:showBubbleSize val="0"/>
-          </c:dLbls>
+          </c:marker>
           <c:cat>
             <c:strRef>
               <c:f>Sheet1!$A$2:$A$6</c:f>
@@ -24114,7 +24077,7 @@
             <c:numRef>
               <c:f>Sheet1!$C$2:$C$6</c:f>
               <c:numCache>
-                <c:formatCode>General</c:formatCode>
+                <c:formatCode>0.0</c:formatCode>
                 <c:ptCount val="5"/>
                 <c:pt idx="0">
                   <c:v>6.2</c:v>
@@ -24134,6 +24097,7 @@
               </c:numCache>
             </c:numRef>
           </c:val>
+          <c:smooth val="0"/>
         </c:ser>
         <c:ser>
           <c:idx val="2"/>
@@ -24144,54 +24108,31 @@
               <c:strCache>
                 <c:ptCount val="1"/>
                 <c:pt idx="0">
-                  <c:v>MKB: rasmiy muammoli kreditlar</c:v>
+                  <c:v>MKB: rasmiy muammoli</c:v>
                 </c:pt>
               </c:strCache>
             </c:strRef>
           </c:tx>
           <c:spPr>
-            <a:solidFill>
-              <a:srgbClr val="A9D18E"/>
-            </a:solidFill>
-            <a:ln w="6350">
+            <a:ln w="28575">
               <a:solidFill>
-                <a:srgbClr val="FFFFFF"/>
+                <a:srgbClr val="70AD47"/>
               </a:solidFill>
+              <a:prstDash val="dash"/>
             </a:ln>
           </c:spPr>
-          <c:invertIfNegative val="0"/>
-          <c:dLbls>
-            <c:numFmt formatCode="0.0" sourceLinked="0"/>
+          <c:marker>
+            <c:symbol val="circle"/>
+            <c:size val="5"/>
             <c:spPr>
-              <a:noFill/>
+              <a:solidFill>
+                <a:srgbClr val="70AD47"/>
+              </a:solidFill>
               <a:ln>
                 <a:noFill/>
               </a:ln>
             </c:spPr>
-            <c:txPr>
-              <a:bodyPr/>
-              <a:lstStyle/>
-              <a:p>
-                <a:pPr>
-                  <a:defRPr sz="1050" b="1">
-                    <a:solidFill>
-                      <a:srgbClr val="000000"/>
-                    </a:solidFill>
-                    <a:latin typeface="Times New Roman"/>
-                    <a:cs typeface="Times New Roman"/>
-                  </a:defRPr>
-                </a:pPr>
-                <a:endParaRPr lang="uz-Latn-UZ"/>
-              </a:p>
-            </c:txPr>
-            <c:dLblPos val="outEnd"/>
-            <c:showLegendKey val="0"/>
-            <c:showVal val="1"/>
-            <c:showCatName val="0"/>
-            <c:showSerName val="0"/>
-            <c:showPercent val="0"/>
-            <c:showBubbleSize val="0"/>
-          </c:dLbls>
+          </c:marker>
           <c:cat>
             <c:strRef>
               <c:f>Sheet1!$A$2:$A$6</c:f>
@@ -24219,7 +24160,7 @@
             <c:numRef>
               <c:f>Sheet1!$D$2:$D$6</c:f>
               <c:numCache>
-                <c:formatCode>General</c:formatCode>
+                <c:formatCode>0.0</c:formatCode>
                 <c:ptCount val="5"/>
                 <c:pt idx="0">
                   <c:v>5.9</c:v>
@@ -24239,6 +24180,7 @@
               </c:numCache>
             </c:numRef>
           </c:val>
+          <c:smooth val="0"/>
         </c:ser>
         <c:ser>
           <c:idx val="3"/>
@@ -24249,54 +24191,30 @@
               <c:strCache>
                 <c:ptCount val="1"/>
                 <c:pt idx="0">
-                  <c:v>MKB: MHXS 9 bo‘yicha 3-bosqich</c:v>
+                  <c:v>MKB: 3-bosqich (MHXS)</c:v>
                 </c:pt>
               </c:strCache>
             </c:strRef>
           </c:tx>
           <c:spPr>
-            <a:solidFill>
-              <a:srgbClr val="38761D"/>
-            </a:solidFill>
-            <a:ln w="6350">
+            <a:ln w="28575">
               <a:solidFill>
-                <a:srgbClr val="FFFFFF"/>
+                <a:srgbClr val="375623"/>
               </a:solidFill>
             </a:ln>
           </c:spPr>
-          <c:invertIfNegative val="0"/>
-          <c:dLbls>
-            <c:numFmt formatCode="0.0" sourceLinked="0"/>
+          <c:marker>
+            <c:symbol val="circle"/>
+            <c:size val="5"/>
             <c:spPr>
-              <a:noFill/>
+              <a:solidFill>
+                <a:srgbClr val="375623"/>
+              </a:solidFill>
               <a:ln>
                 <a:noFill/>
               </a:ln>
             </c:spPr>
-            <c:txPr>
-              <a:bodyPr/>
-              <a:lstStyle/>
-              <a:p>
-                <a:pPr>
-                  <a:defRPr sz="1050" b="1">
-                    <a:solidFill>
-                      <a:srgbClr val="000000"/>
-                    </a:solidFill>
-                    <a:latin typeface="Times New Roman"/>
-                    <a:cs typeface="Times New Roman"/>
-                  </a:defRPr>
-                </a:pPr>
-                <a:endParaRPr lang="uz-Latn-UZ"/>
-              </a:p>
-            </c:txPr>
-            <c:dLblPos val="outEnd"/>
-            <c:showLegendKey val="0"/>
-            <c:showVal val="1"/>
-            <c:showCatName val="0"/>
-            <c:showSerName val="0"/>
-            <c:showPercent val="0"/>
-            <c:showBubbleSize val="0"/>
-          </c:dLbls>
+          </c:marker>
           <c:cat>
             <c:strRef>
               <c:f>Sheet1!$A$2:$A$6</c:f>
@@ -24324,7 +24242,7 @@
             <c:numRef>
               <c:f>Sheet1!$E$2:$E$6</c:f>
               <c:numCache>
-                <c:formatCode>General</c:formatCode>
+                <c:formatCode>0.0</c:formatCode>
                 <c:ptCount val="5"/>
                 <c:pt idx="0">
                   <c:v>17.4</c:v>
@@ -24344,6 +24262,7 @@
               </c:numCache>
             </c:numRef>
           </c:val>
+          <c:smooth val="0"/>
         </c:ser>
         <c:ser>
           <c:idx val="4"/>
@@ -24354,54 +24273,31 @@
               <c:strCache>
                 <c:ptCount val="1"/>
                 <c:pt idx="0">
-                  <c:v>Aloqabank: rasmiy muammoli kreditlar</c:v>
+                  <c:v>Aloqabank: rasmiy muammoli</c:v>
                 </c:pt>
               </c:strCache>
             </c:strRef>
           </c:tx>
           <c:spPr>
-            <a:solidFill>
-              <a:srgbClr val="F4B183"/>
-            </a:solidFill>
-            <a:ln w="6350">
+            <a:ln w="28575">
               <a:solidFill>
-                <a:srgbClr val="FFFFFF"/>
+                <a:srgbClr val="ED7D31"/>
               </a:solidFill>
+              <a:prstDash val="dash"/>
             </a:ln>
           </c:spPr>
-          <c:invertIfNegative val="0"/>
-          <c:dLbls>
-            <c:numFmt formatCode="0.0" sourceLinked="0"/>
+          <c:marker>
+            <c:symbol val="circle"/>
+            <c:size val="5"/>
             <c:spPr>
-              <a:noFill/>
+              <a:solidFill>
+                <a:srgbClr val="ED7D31"/>
+              </a:solidFill>
               <a:ln>
                 <a:noFill/>
               </a:ln>
             </c:spPr>
-            <c:txPr>
-              <a:bodyPr/>
-              <a:lstStyle/>
-              <a:p>
-                <a:pPr>
-                  <a:defRPr sz="1050" b="1">
-                    <a:solidFill>
-                      <a:srgbClr val="000000"/>
-                    </a:solidFill>
-                    <a:latin typeface="Times New Roman"/>
-                    <a:cs typeface="Times New Roman"/>
-                  </a:defRPr>
-                </a:pPr>
-                <a:endParaRPr lang="uz-Latn-UZ"/>
-              </a:p>
-            </c:txPr>
-            <c:dLblPos val="outEnd"/>
-            <c:showLegendKey val="0"/>
-            <c:showVal val="1"/>
-            <c:showCatName val="0"/>
-            <c:showSerName val="0"/>
-            <c:showPercent val="0"/>
-            <c:showBubbleSize val="0"/>
-          </c:dLbls>
+          </c:marker>
           <c:cat>
             <c:strRef>
               <c:f>Sheet1!$A$2:$A$6</c:f>
@@ -24429,7 +24325,7 @@
             <c:numRef>
               <c:f>Sheet1!$F$2:$F$6</c:f>
               <c:numCache>
-                <c:formatCode>General</c:formatCode>
+                <c:formatCode>0.0</c:formatCode>
                 <c:ptCount val="5"/>
                 <c:pt idx="0">
                   <c:v>4.1</c:v>
@@ -24449,6 +24345,7 @@
               </c:numCache>
             </c:numRef>
           </c:val>
+          <c:smooth val="0"/>
         </c:ser>
         <c:ser>
           <c:idx val="5"/>
@@ -24459,54 +24356,30 @@
               <c:strCache>
                 <c:ptCount val="1"/>
                 <c:pt idx="0">
-                  <c:v>Aloqabank: MHXS 9 bo‘yicha 3-bosqich</c:v>
+                  <c:v>Aloqabank: 3-bosqich (MHXS)</c:v>
                 </c:pt>
               </c:strCache>
             </c:strRef>
           </c:tx>
           <c:spPr>
-            <a:solidFill>
-              <a:srgbClr val="C55A11"/>
-            </a:solidFill>
-            <a:ln w="6350">
+            <a:ln w="28575">
               <a:solidFill>
-                <a:srgbClr val="FFFFFF"/>
+                <a:srgbClr val="C00000"/>
               </a:solidFill>
             </a:ln>
           </c:spPr>
-          <c:invertIfNegative val="0"/>
-          <c:dLbls>
-            <c:numFmt formatCode="0.0" sourceLinked="0"/>
+          <c:marker>
+            <c:symbol val="circle"/>
+            <c:size val="5"/>
             <c:spPr>
-              <a:noFill/>
+              <a:solidFill>
+                <a:srgbClr val="C00000"/>
+              </a:solidFill>
               <a:ln>
                 <a:noFill/>
               </a:ln>
             </c:spPr>
-            <c:txPr>
-              <a:bodyPr/>
-              <a:lstStyle/>
-              <a:p>
-                <a:pPr>
-                  <a:defRPr sz="1050" b="1">
-                    <a:solidFill>
-                      <a:srgbClr val="000000"/>
-                    </a:solidFill>
-                    <a:latin typeface="Times New Roman"/>
-                    <a:cs typeface="Times New Roman"/>
-                  </a:defRPr>
-                </a:pPr>
-                <a:endParaRPr lang="uz-Latn-UZ"/>
-              </a:p>
-            </c:txPr>
-            <c:dLblPos val="outEnd"/>
-            <c:showLegendKey val="0"/>
-            <c:showVal val="1"/>
-            <c:showCatName val="0"/>
-            <c:showSerName val="0"/>
-            <c:showPercent val="0"/>
-            <c:showBubbleSize val="0"/>
-          </c:dLbls>
+          </c:marker>
           <c:cat>
             <c:strRef>
               <c:f>Sheet1!$A$2:$A$6</c:f>
@@ -24534,7 +24407,7 @@
             <c:numRef>
               <c:f>Sheet1!$G$2:$G$6</c:f>
               <c:numCache>
-                <c:formatCode>General</c:formatCode>
+                <c:formatCode>0.0</c:formatCode>
                 <c:ptCount val="5"/>
                 <c:pt idx="0">
                   <c:v>10.0</c:v>
@@ -24554,11 +24427,12 @@
               </c:numCache>
             </c:numRef>
           </c:val>
+          <c:smooth val="0"/>
         </c:ser>
-        <c:gapWidth val="40"/>
+        <c:marker val="1"/>
         <c:axId val="111"/>
         <c:axId val="222"/>
-      </c:barChart>
+      </c:lineChart>
       <c:catAx>
         <c:axId val="111"/>
         <c:scaling>
@@ -24619,36 +24493,7 @@
             </a:ln>
           </c:spPr>
         </c:majorGridlines>
-        <c:title>
-          <c:tx>
-            <c:rich>
-              <a:bodyPr rot="-5400000" vert="horz"/>
-              <a:lstStyle/>
-              <a:p>
-                <a:pPr>
-                  <a:defRPr sz="1100" b="0">
-                    <a:solidFill>
-                      <a:srgbClr val="000000"/>
-                    </a:solidFill>
-                    <a:latin typeface="Times New Roman"/>
-                    <a:cs typeface="Times New Roman"/>
-                  </a:defRPr>
-                </a:pPr>
-                <a:r>
-                  <a:rPr lang="uz-Latn-UZ" sz="1100" b="0">
-                    <a:solidFill>
-                      <a:srgbClr val="000000"/>
-                    </a:solidFill>
-                    <a:latin typeface="Times New Roman"/>
-                  </a:rPr>
-                  <a:t>Jami kreditlarga nisbatan, %</a:t>
-                </a:r>
-              </a:p>
-            </c:rich>
-          </c:tx>
-          <c:overlay val="0"/>
-        </c:title>
-        <c:numFmt formatCode="General" sourceLinked="0"/>
+        <c:numFmt formatCode="0" sourceLinked="0"/>
         <c:majorTickMark val="out"/>
         <c:minorTickMark val="none"/>
         <c:tickLblPos val="low"/>
@@ -24680,6 +24525,36 @@
         <c:crossBetween val="between"/>
         <c:majorUnit val="4"/>
       </c:valAx>
+      <c:dTable>
+        <c:showHorzBorder val="1"/>
+        <c:showVertBorder val="1"/>
+        <c:showOutline val="1"/>
+        <c:showKeys val="1"/>
+        <c:spPr>
+          <a:noFill/>
+          <a:ln w="9525">
+            <a:solidFill>
+              <a:srgbClr val="7F7F7F"/>
+            </a:solidFill>
+          </a:ln>
+        </c:spPr>
+        <c:txPr>
+          <a:bodyPr/>
+          <a:lstStyle/>
+          <a:p>
+            <a:pPr>
+              <a:defRPr sz="1000" b="1">
+                <a:solidFill>
+                  <a:srgbClr val="000000"/>
+                </a:solidFill>
+                <a:latin typeface="Times New Roman"/>
+                <a:cs typeface="Times New Roman"/>
+              </a:defRPr>
+            </a:pPr>
+            <a:endParaRPr lang="uz-Latn-UZ"/>
+          </a:p>
+        </c:txPr>
+      </c:dTable>
       <c:spPr>
         <a:noFill/>
         <a:ln>
@@ -24687,26 +24562,6 @@
         </a:ln>
       </c:spPr>
     </c:plotArea>
-    <c:legend>
-      <c:legendPos val="b"/>
-      <c:overlay val="0"/>
-      <c:txPr>
-        <a:bodyPr/>
-        <a:lstStyle/>
-        <a:p>
-          <a:pPr>
-            <a:defRPr sz="1050" b="0">
-              <a:solidFill>
-                <a:srgbClr val="000000"/>
-              </a:solidFill>
-              <a:latin typeface="Times New Roman"/>
-              <a:cs typeface="Times New Roman"/>
-            </a:defRPr>
-          </a:pPr>
-          <a:endParaRPr lang="uz-Latn-UZ"/>
-        </a:p>
-      </c:txPr>
-    </c:legend>
     <c:plotVisOnly val="1"/>
     <c:dispBlanksAs val="gap"/>
   </c:chart>

</xml_diff>

<commit_message>
2.2.7-rasm namunasi: vertikal o'q 0 dan, diagramma ostida unga moslangan Word jadvali
Co-Authored-By: Claude Opus 5.5 <noreply@anthropic.com>
Claude-Session: https://claude.ai/code/session_01PxHTC8Q7yHdrpAeUA5KUgM
</commit_message>
<xml_diff>
--- a/Namuna_2.2.7-rasm_Aloqabank.docx
+++ b/Namuna_2.2.7-rasm_Aloqabank.docx
@@ -15,7 +15,7 @@
         </w:rPr>
         <w:drawing>
           <wp:inline distT="0" distB="0" distL="0" distR="0">
-            <wp:extent cx="5940000" cy="3960000"/>
+            <wp:extent cx="5940000" cy="2340000"/>
             <wp:effectExtent l="0" t="0" r="0" b="0"/>
             <wp:docPr id="1001" name="2.2.7-rasm"/>
             <wp:cNvGraphicFramePr/>
@@ -28,6 +28,931 @@
         </w:drawing>
       </w:r>
     </w:p>
+    <w:tbl>
+      <w:tblPr>
+        <w:tblStyle w:val="TableGrid"/>
+        <w:jc w:val="center"/>
+        <w:tblLayout w:type="fixed"/>
+        <w:tblLook w:firstColumn="1" w:firstRow="1" w:lastColumn="0" w:lastRow="0" w:noHBand="0" w:noVBand="1" w:val="04A0"/>
+        <w:tblLayout w:type="fixed"/>
+        <w:tblW w:w="9263" w:type="dxa"/>
+      </w:tblPr>
+      <w:tblGrid>
+        <w:gridCol w:w="3368"/>
+        <w:gridCol w:w="1179"/>
+        <w:gridCol w:w="1179"/>
+        <w:gridCol w:w="1179"/>
+        <w:gridCol w:w="1179"/>
+        <w:gridCol w:w="1179"/>
+      </w:tblGrid>
+      <w:tr>
+        <w:tc>
+          <w:tcPr>
+            <w:tcW w:type="dxa" w:w="3368"/>
+          </w:tcPr>
+          <w:p>
+            <w:pPr>
+              <w:spacing w:before="0" w:after="0" w:line="240" w:lineRule="auto"/>
+              <w:ind w:firstLine="0"/>
+              <w:jc w:val="left"/>
+            </w:pPr>
+            <w:r>
+              <w:rPr>
+                <w:rFonts w:ascii="Times New Roman" w:hAnsi="Times New Roman"/>
+                <w:b/>
+                <w:sz w:val="19"/>
+              </w:rPr>
+            </w:r>
+          </w:p>
+        </w:tc>
+        <w:tc>
+          <w:tcPr>
+            <w:tcW w:type="dxa" w:w="1179"/>
+          </w:tcPr>
+          <w:p>
+            <w:pPr>
+              <w:spacing w:before="0" w:after="0" w:line="240" w:lineRule="auto"/>
+              <w:ind w:firstLine="0"/>
+              <w:jc w:val="center"/>
+            </w:pPr>
+            <w:r>
+              <w:rPr>
+                <w:rFonts w:ascii="Times New Roman" w:hAnsi="Times New Roman"/>
+                <w:b/>
+                <w:sz w:val="19"/>
+              </w:rPr>
+              <w:t>2021</w:t>
+            </w:r>
+          </w:p>
+        </w:tc>
+        <w:tc>
+          <w:tcPr>
+            <w:tcW w:type="dxa" w:w="1179"/>
+          </w:tcPr>
+          <w:p>
+            <w:pPr>
+              <w:spacing w:before="0" w:after="0" w:line="240" w:lineRule="auto"/>
+              <w:ind w:firstLine="0"/>
+              <w:jc w:val="center"/>
+            </w:pPr>
+            <w:r>
+              <w:rPr>
+                <w:rFonts w:ascii="Times New Roman" w:hAnsi="Times New Roman"/>
+                <w:b/>
+                <w:sz w:val="19"/>
+              </w:rPr>
+              <w:t>2022</w:t>
+            </w:r>
+          </w:p>
+        </w:tc>
+        <w:tc>
+          <w:tcPr>
+            <w:tcW w:type="dxa" w:w="1179"/>
+          </w:tcPr>
+          <w:p>
+            <w:pPr>
+              <w:spacing w:before="0" w:after="0" w:line="240" w:lineRule="auto"/>
+              <w:ind w:firstLine="0"/>
+              <w:jc w:val="center"/>
+            </w:pPr>
+            <w:r>
+              <w:rPr>
+                <w:rFonts w:ascii="Times New Roman" w:hAnsi="Times New Roman"/>
+                <w:b/>
+                <w:sz w:val="19"/>
+              </w:rPr>
+              <w:t>2023</w:t>
+            </w:r>
+          </w:p>
+        </w:tc>
+        <w:tc>
+          <w:tcPr>
+            <w:tcW w:type="dxa" w:w="1179"/>
+          </w:tcPr>
+          <w:p>
+            <w:pPr>
+              <w:spacing w:before="0" w:after="0" w:line="240" w:lineRule="auto"/>
+              <w:ind w:firstLine="0"/>
+              <w:jc w:val="center"/>
+            </w:pPr>
+            <w:r>
+              <w:rPr>
+                <w:rFonts w:ascii="Times New Roman" w:hAnsi="Times New Roman"/>
+                <w:b/>
+                <w:sz w:val="19"/>
+              </w:rPr>
+              <w:t>2024</w:t>
+            </w:r>
+          </w:p>
+        </w:tc>
+        <w:tc>
+          <w:tcPr>
+            <w:tcW w:type="dxa" w:w="1179"/>
+          </w:tcPr>
+          <w:p>
+            <w:pPr>
+              <w:spacing w:before="0" w:after="0" w:line="240" w:lineRule="auto"/>
+              <w:ind w:firstLine="0"/>
+              <w:jc w:val="center"/>
+            </w:pPr>
+            <w:r>
+              <w:rPr>
+                <w:rFonts w:ascii="Times New Roman" w:hAnsi="Times New Roman"/>
+                <w:b/>
+                <w:sz w:val="19"/>
+              </w:rPr>
+              <w:t>2025</w:t>
+            </w:r>
+          </w:p>
+        </w:tc>
+      </w:tr>
+      <w:tr>
+        <w:tc>
+          <w:tcPr>
+            <w:tcW w:type="dxa" w:w="3368"/>
+          </w:tcPr>
+          <w:p>
+            <w:pPr>
+              <w:spacing w:before="0" w:after="0" w:line="240" w:lineRule="auto"/>
+              <w:ind w:firstLine="0"/>
+              <w:jc w:val="left"/>
+            </w:pPr>
+            <w:r>
+              <w:rPr>
+                <w:rFonts w:ascii="Times New Roman" w:hAnsi="Times New Roman"/>
+                <w:b/>
+                <w:color w:val="5B9BD5"/>
+                <w:sz w:val="19"/>
+              </w:rPr>
+              <w:t xml:space="preserve">– – ●  </w:t>
+            </w:r>
+            <w:r>
+              <w:rPr>
+                <w:rFonts w:ascii="Times New Roman" w:hAnsi="Times New Roman"/>
+                <w:b/>
+                <w:sz w:val="19"/>
+              </w:rPr>
+              <w:t>SQB: rasmiy muammoli</w:t>
+            </w:r>
+          </w:p>
+        </w:tc>
+        <w:tc>
+          <w:tcPr>
+            <w:tcW w:type="dxa" w:w="1179"/>
+          </w:tcPr>
+          <w:p>
+            <w:pPr>
+              <w:spacing w:before="0" w:after="0" w:line="240" w:lineRule="auto"/>
+              <w:ind w:firstLine="0"/>
+              <w:jc w:val="center"/>
+            </w:pPr>
+            <w:r>
+              <w:rPr>
+                <w:rFonts w:ascii="Times New Roman" w:hAnsi="Times New Roman"/>
+                <w:b/>
+                <w:sz w:val="19"/>
+              </w:rPr>
+              <w:t>3,8</w:t>
+            </w:r>
+          </w:p>
+        </w:tc>
+        <w:tc>
+          <w:tcPr>
+            <w:tcW w:type="dxa" w:w="1179"/>
+          </w:tcPr>
+          <w:p>
+            <w:pPr>
+              <w:spacing w:before="0" w:after="0" w:line="240" w:lineRule="auto"/>
+              <w:ind w:firstLine="0"/>
+              <w:jc w:val="center"/>
+            </w:pPr>
+            <w:r>
+              <w:rPr>
+                <w:rFonts w:ascii="Times New Roman" w:hAnsi="Times New Roman"/>
+                <w:b/>
+                <w:sz w:val="19"/>
+              </w:rPr>
+              <w:t>2,8</w:t>
+            </w:r>
+          </w:p>
+        </w:tc>
+        <w:tc>
+          <w:tcPr>
+            <w:tcW w:type="dxa" w:w="1179"/>
+          </w:tcPr>
+          <w:p>
+            <w:pPr>
+              <w:spacing w:before="0" w:after="0" w:line="240" w:lineRule="auto"/>
+              <w:ind w:firstLine="0"/>
+              <w:jc w:val="center"/>
+            </w:pPr>
+            <w:r>
+              <w:rPr>
+                <w:rFonts w:ascii="Times New Roman" w:hAnsi="Times New Roman"/>
+                <w:b/>
+                <w:sz w:val="19"/>
+              </w:rPr>
+              <w:t>2,2</w:t>
+            </w:r>
+          </w:p>
+        </w:tc>
+        <w:tc>
+          <w:tcPr>
+            <w:tcW w:type="dxa" w:w="1179"/>
+          </w:tcPr>
+          <w:p>
+            <w:pPr>
+              <w:spacing w:before="0" w:after="0" w:line="240" w:lineRule="auto"/>
+              <w:ind w:firstLine="0"/>
+              <w:jc w:val="center"/>
+            </w:pPr>
+            <w:r>
+              <w:rPr>
+                <w:rFonts w:ascii="Times New Roman" w:hAnsi="Times New Roman"/>
+                <w:b/>
+                <w:sz w:val="19"/>
+              </w:rPr>
+              <w:t>2,8</w:t>
+            </w:r>
+          </w:p>
+        </w:tc>
+        <w:tc>
+          <w:tcPr>
+            <w:tcW w:type="dxa" w:w="1179"/>
+          </w:tcPr>
+          <w:p>
+            <w:pPr>
+              <w:spacing w:before="0" w:after="0" w:line="240" w:lineRule="auto"/>
+              <w:ind w:firstLine="0"/>
+              <w:jc w:val="center"/>
+            </w:pPr>
+            <w:r>
+              <w:rPr>
+                <w:rFonts w:ascii="Times New Roman" w:hAnsi="Times New Roman"/>
+                <w:b/>
+                <w:sz w:val="19"/>
+              </w:rPr>
+              <w:t>2,5</w:t>
+            </w:r>
+          </w:p>
+        </w:tc>
+      </w:tr>
+      <w:tr>
+        <w:tc>
+          <w:tcPr>
+            <w:tcW w:type="dxa" w:w="3368"/>
+          </w:tcPr>
+          <w:p>
+            <w:pPr>
+              <w:spacing w:before="0" w:after="0" w:line="240" w:lineRule="auto"/>
+              <w:ind w:firstLine="0"/>
+              <w:jc w:val="left"/>
+            </w:pPr>
+            <w:r>
+              <w:rPr>
+                <w:rFonts w:ascii="Times New Roman" w:hAnsi="Times New Roman"/>
+                <w:b/>
+                <w:color w:val="1F4E79"/>
+                <w:sz w:val="19"/>
+              </w:rPr>
+              <w:t xml:space="preserve">——●  </w:t>
+            </w:r>
+            <w:r>
+              <w:rPr>
+                <w:rFonts w:ascii="Times New Roman" w:hAnsi="Times New Roman"/>
+                <w:b/>
+                <w:sz w:val="19"/>
+              </w:rPr>
+              <w:t>SQB: 3-bosqich (MHXS)</w:t>
+            </w:r>
+          </w:p>
+        </w:tc>
+        <w:tc>
+          <w:tcPr>
+            <w:tcW w:type="dxa" w:w="1179"/>
+          </w:tcPr>
+          <w:p>
+            <w:pPr>
+              <w:spacing w:before="0" w:after="0" w:line="240" w:lineRule="auto"/>
+              <w:ind w:firstLine="0"/>
+              <w:jc w:val="center"/>
+            </w:pPr>
+            <w:r>
+              <w:rPr>
+                <w:rFonts w:ascii="Times New Roman" w:hAnsi="Times New Roman"/>
+                <w:b/>
+                <w:sz w:val="19"/>
+              </w:rPr>
+              <w:t>6,2</w:t>
+            </w:r>
+          </w:p>
+        </w:tc>
+        <w:tc>
+          <w:tcPr>
+            <w:tcW w:type="dxa" w:w="1179"/>
+          </w:tcPr>
+          <w:p>
+            <w:pPr>
+              <w:spacing w:before="0" w:after="0" w:line="240" w:lineRule="auto"/>
+              <w:ind w:firstLine="0"/>
+              <w:jc w:val="center"/>
+            </w:pPr>
+            <w:r>
+              <w:rPr>
+                <w:rFonts w:ascii="Times New Roman" w:hAnsi="Times New Roman"/>
+                <w:b/>
+                <w:sz w:val="19"/>
+              </w:rPr>
+              <w:t>7,4</w:t>
+            </w:r>
+          </w:p>
+        </w:tc>
+        <w:tc>
+          <w:tcPr>
+            <w:tcW w:type="dxa" w:w="1179"/>
+          </w:tcPr>
+          <w:p>
+            <w:pPr>
+              <w:spacing w:before="0" w:after="0" w:line="240" w:lineRule="auto"/>
+              <w:ind w:firstLine="0"/>
+              <w:jc w:val="center"/>
+            </w:pPr>
+            <w:r>
+              <w:rPr>
+                <w:rFonts w:ascii="Times New Roman" w:hAnsi="Times New Roman"/>
+                <w:b/>
+                <w:sz w:val="19"/>
+              </w:rPr>
+              <w:t>4,8</w:t>
+            </w:r>
+          </w:p>
+        </w:tc>
+        <w:tc>
+          <w:tcPr>
+            <w:tcW w:type="dxa" w:w="1179"/>
+          </w:tcPr>
+          <w:p>
+            <w:pPr>
+              <w:spacing w:before="0" w:after="0" w:line="240" w:lineRule="auto"/>
+              <w:ind w:firstLine="0"/>
+              <w:jc w:val="center"/>
+            </w:pPr>
+            <w:r>
+              <w:rPr>
+                <w:rFonts w:ascii="Times New Roman" w:hAnsi="Times New Roman"/>
+                <w:b/>
+                <w:sz w:val="19"/>
+              </w:rPr>
+              <w:t>5,9</w:t>
+            </w:r>
+          </w:p>
+        </w:tc>
+        <w:tc>
+          <w:tcPr>
+            <w:tcW w:type="dxa" w:w="1179"/>
+          </w:tcPr>
+          <w:p>
+            <w:pPr>
+              <w:spacing w:before="0" w:after="0" w:line="240" w:lineRule="auto"/>
+              <w:ind w:firstLine="0"/>
+              <w:jc w:val="center"/>
+            </w:pPr>
+            <w:r>
+              <w:rPr>
+                <w:rFonts w:ascii="Times New Roman" w:hAnsi="Times New Roman"/>
+                <w:b/>
+                <w:sz w:val="19"/>
+              </w:rPr>
+              <w:t>7,5</w:t>
+            </w:r>
+          </w:p>
+        </w:tc>
+      </w:tr>
+      <w:tr>
+        <w:tc>
+          <w:tcPr>
+            <w:tcW w:type="dxa" w:w="3368"/>
+          </w:tcPr>
+          <w:p>
+            <w:pPr>
+              <w:spacing w:before="0" w:after="0" w:line="240" w:lineRule="auto"/>
+              <w:ind w:firstLine="0"/>
+              <w:jc w:val="left"/>
+            </w:pPr>
+            <w:r>
+              <w:rPr>
+                <w:rFonts w:ascii="Times New Roman" w:hAnsi="Times New Roman"/>
+                <w:b/>
+                <w:color w:val="70AD47"/>
+                <w:sz w:val="19"/>
+              </w:rPr>
+              <w:t xml:space="preserve">– – ●  </w:t>
+            </w:r>
+            <w:r>
+              <w:rPr>
+                <w:rFonts w:ascii="Times New Roman" w:hAnsi="Times New Roman"/>
+                <w:b/>
+                <w:sz w:val="19"/>
+              </w:rPr>
+              <w:t>MKB: rasmiy muammoli</w:t>
+            </w:r>
+          </w:p>
+        </w:tc>
+        <w:tc>
+          <w:tcPr>
+            <w:tcW w:type="dxa" w:w="1179"/>
+          </w:tcPr>
+          <w:p>
+            <w:pPr>
+              <w:spacing w:before="0" w:after="0" w:line="240" w:lineRule="auto"/>
+              <w:ind w:firstLine="0"/>
+              <w:jc w:val="center"/>
+            </w:pPr>
+            <w:r>
+              <w:rPr>
+                <w:rFonts w:ascii="Times New Roman" w:hAnsi="Times New Roman"/>
+                <w:b/>
+                <w:sz w:val="19"/>
+              </w:rPr>
+              <w:t>5,9</w:t>
+            </w:r>
+          </w:p>
+        </w:tc>
+        <w:tc>
+          <w:tcPr>
+            <w:tcW w:type="dxa" w:w="1179"/>
+          </w:tcPr>
+          <w:p>
+            <w:pPr>
+              <w:spacing w:before="0" w:after="0" w:line="240" w:lineRule="auto"/>
+              <w:ind w:firstLine="0"/>
+              <w:jc w:val="center"/>
+            </w:pPr>
+            <w:r>
+              <w:rPr>
+                <w:rFonts w:ascii="Times New Roman" w:hAnsi="Times New Roman"/>
+                <w:b/>
+                <w:sz w:val="19"/>
+              </w:rPr>
+              <w:t>4,8</w:t>
+            </w:r>
+          </w:p>
+        </w:tc>
+        <w:tc>
+          <w:tcPr>
+            <w:tcW w:type="dxa" w:w="1179"/>
+          </w:tcPr>
+          <w:p>
+            <w:pPr>
+              <w:spacing w:before="0" w:after="0" w:line="240" w:lineRule="auto"/>
+              <w:ind w:firstLine="0"/>
+              <w:jc w:val="center"/>
+            </w:pPr>
+            <w:r>
+              <w:rPr>
+                <w:rFonts w:ascii="Times New Roman" w:hAnsi="Times New Roman"/>
+                <w:b/>
+                <w:sz w:val="19"/>
+              </w:rPr>
+              <w:t>6,0</w:t>
+            </w:r>
+          </w:p>
+        </w:tc>
+        <w:tc>
+          <w:tcPr>
+            <w:tcW w:type="dxa" w:w="1179"/>
+          </w:tcPr>
+          <w:p>
+            <w:pPr>
+              <w:spacing w:before="0" w:after="0" w:line="240" w:lineRule="auto"/>
+              <w:ind w:firstLine="0"/>
+              <w:jc w:val="center"/>
+            </w:pPr>
+            <w:r>
+              <w:rPr>
+                <w:rFonts w:ascii="Times New Roman" w:hAnsi="Times New Roman"/>
+                <w:b/>
+                <w:sz w:val="19"/>
+              </w:rPr>
+              <w:t>4,6</w:t>
+            </w:r>
+          </w:p>
+        </w:tc>
+        <w:tc>
+          <w:tcPr>
+            <w:tcW w:type="dxa" w:w="1179"/>
+          </w:tcPr>
+          <w:p>
+            <w:pPr>
+              <w:spacing w:before="0" w:after="0" w:line="240" w:lineRule="auto"/>
+              <w:ind w:firstLine="0"/>
+              <w:jc w:val="center"/>
+            </w:pPr>
+            <w:r>
+              <w:rPr>
+                <w:rFonts w:ascii="Times New Roman" w:hAnsi="Times New Roman"/>
+                <w:b/>
+                <w:sz w:val="19"/>
+              </w:rPr>
+              <w:t>4,4</w:t>
+            </w:r>
+          </w:p>
+        </w:tc>
+      </w:tr>
+      <w:tr>
+        <w:tc>
+          <w:tcPr>
+            <w:tcW w:type="dxa" w:w="3368"/>
+          </w:tcPr>
+          <w:p>
+            <w:pPr>
+              <w:spacing w:before="0" w:after="0" w:line="240" w:lineRule="auto"/>
+              <w:ind w:firstLine="0"/>
+              <w:jc w:val="left"/>
+            </w:pPr>
+            <w:r>
+              <w:rPr>
+                <w:rFonts w:ascii="Times New Roman" w:hAnsi="Times New Roman"/>
+                <w:b/>
+                <w:color w:val="375623"/>
+                <w:sz w:val="19"/>
+              </w:rPr>
+              <w:t xml:space="preserve">——●  </w:t>
+            </w:r>
+            <w:r>
+              <w:rPr>
+                <w:rFonts w:ascii="Times New Roman" w:hAnsi="Times New Roman"/>
+                <w:b/>
+                <w:sz w:val="19"/>
+              </w:rPr>
+              <w:t>MKB: 3-bosqich (MHXS)</w:t>
+            </w:r>
+          </w:p>
+        </w:tc>
+        <w:tc>
+          <w:tcPr>
+            <w:tcW w:type="dxa" w:w="1179"/>
+          </w:tcPr>
+          <w:p>
+            <w:pPr>
+              <w:spacing w:before="0" w:after="0" w:line="240" w:lineRule="auto"/>
+              <w:ind w:firstLine="0"/>
+              <w:jc w:val="center"/>
+            </w:pPr>
+            <w:r>
+              <w:rPr>
+                <w:rFonts w:ascii="Times New Roman" w:hAnsi="Times New Roman"/>
+                <w:b/>
+                <w:sz w:val="19"/>
+              </w:rPr>
+              <w:t>17,4</w:t>
+            </w:r>
+          </w:p>
+        </w:tc>
+        <w:tc>
+          <w:tcPr>
+            <w:tcW w:type="dxa" w:w="1179"/>
+          </w:tcPr>
+          <w:p>
+            <w:pPr>
+              <w:spacing w:before="0" w:after="0" w:line="240" w:lineRule="auto"/>
+              <w:ind w:firstLine="0"/>
+              <w:jc w:val="center"/>
+            </w:pPr>
+            <w:r>
+              <w:rPr>
+                <w:rFonts w:ascii="Times New Roman" w:hAnsi="Times New Roman"/>
+                <w:b/>
+                <w:sz w:val="19"/>
+              </w:rPr>
+              <w:t>13,5</w:t>
+            </w:r>
+          </w:p>
+        </w:tc>
+        <w:tc>
+          <w:tcPr>
+            <w:tcW w:type="dxa" w:w="1179"/>
+          </w:tcPr>
+          <w:p>
+            <w:pPr>
+              <w:spacing w:before="0" w:after="0" w:line="240" w:lineRule="auto"/>
+              <w:ind w:firstLine="0"/>
+              <w:jc w:val="center"/>
+            </w:pPr>
+            <w:r>
+              <w:rPr>
+                <w:rFonts w:ascii="Times New Roman" w:hAnsi="Times New Roman"/>
+                <w:b/>
+                <w:sz w:val="19"/>
+              </w:rPr>
+              <w:t>16,6</w:t>
+            </w:r>
+          </w:p>
+        </w:tc>
+        <w:tc>
+          <w:tcPr>
+            <w:tcW w:type="dxa" w:w="1179"/>
+          </w:tcPr>
+          <w:p>
+            <w:pPr>
+              <w:spacing w:before="0" w:after="0" w:line="240" w:lineRule="auto"/>
+              <w:ind w:firstLine="0"/>
+              <w:jc w:val="center"/>
+            </w:pPr>
+            <w:r>
+              <w:rPr>
+                <w:rFonts w:ascii="Times New Roman" w:hAnsi="Times New Roman"/>
+                <w:b/>
+                <w:sz w:val="19"/>
+              </w:rPr>
+              <w:t>15,2</w:t>
+            </w:r>
+          </w:p>
+        </w:tc>
+        <w:tc>
+          <w:tcPr>
+            <w:tcW w:type="dxa" w:w="1179"/>
+          </w:tcPr>
+          <w:p>
+            <w:pPr>
+              <w:spacing w:before="0" w:after="0" w:line="240" w:lineRule="auto"/>
+              <w:ind w:firstLine="0"/>
+              <w:jc w:val="center"/>
+            </w:pPr>
+            <w:r>
+              <w:rPr>
+                <w:rFonts w:ascii="Times New Roman" w:hAnsi="Times New Roman"/>
+                <w:b/>
+                <w:sz w:val="19"/>
+              </w:rPr>
+              <w:t>12,3</w:t>
+            </w:r>
+          </w:p>
+        </w:tc>
+      </w:tr>
+      <w:tr>
+        <w:tc>
+          <w:tcPr>
+            <w:tcW w:type="dxa" w:w="3368"/>
+          </w:tcPr>
+          <w:p>
+            <w:pPr>
+              <w:spacing w:before="0" w:after="0" w:line="240" w:lineRule="auto"/>
+              <w:ind w:firstLine="0"/>
+              <w:jc w:val="left"/>
+            </w:pPr>
+            <w:r>
+              <w:rPr>
+                <w:rFonts w:ascii="Times New Roman" w:hAnsi="Times New Roman"/>
+                <w:b/>
+                <w:color w:val="ED7D31"/>
+                <w:sz w:val="19"/>
+              </w:rPr>
+              <w:t xml:space="preserve">– – ●  </w:t>
+            </w:r>
+            <w:r>
+              <w:rPr>
+                <w:rFonts w:ascii="Times New Roman" w:hAnsi="Times New Roman"/>
+                <w:b/>
+                <w:sz w:val="19"/>
+              </w:rPr>
+              <w:t>Aloqabank: rasmiy muammoli</w:t>
+            </w:r>
+          </w:p>
+        </w:tc>
+        <w:tc>
+          <w:tcPr>
+            <w:tcW w:type="dxa" w:w="1179"/>
+          </w:tcPr>
+          <w:p>
+            <w:pPr>
+              <w:spacing w:before="0" w:after="0" w:line="240" w:lineRule="auto"/>
+              <w:ind w:firstLine="0"/>
+              <w:jc w:val="center"/>
+            </w:pPr>
+            <w:r>
+              <w:rPr>
+                <w:rFonts w:ascii="Times New Roman" w:hAnsi="Times New Roman"/>
+                <w:b/>
+                <w:sz w:val="19"/>
+              </w:rPr>
+              <w:t>4,1</w:t>
+            </w:r>
+          </w:p>
+        </w:tc>
+        <w:tc>
+          <w:tcPr>
+            <w:tcW w:type="dxa" w:w="1179"/>
+          </w:tcPr>
+          <w:p>
+            <w:pPr>
+              <w:spacing w:before="0" w:after="0" w:line="240" w:lineRule="auto"/>
+              <w:ind w:firstLine="0"/>
+              <w:jc w:val="center"/>
+            </w:pPr>
+            <w:r>
+              <w:rPr>
+                <w:rFonts w:ascii="Times New Roman" w:hAnsi="Times New Roman"/>
+                <w:b/>
+                <w:sz w:val="19"/>
+              </w:rPr>
+              <w:t>2,0</w:t>
+            </w:r>
+          </w:p>
+        </w:tc>
+        <w:tc>
+          <w:tcPr>
+            <w:tcW w:type="dxa" w:w="1179"/>
+          </w:tcPr>
+          <w:p>
+            <w:pPr>
+              <w:spacing w:before="0" w:after="0" w:line="240" w:lineRule="auto"/>
+              <w:ind w:firstLine="0"/>
+              <w:jc w:val="center"/>
+            </w:pPr>
+            <w:r>
+              <w:rPr>
+                <w:rFonts w:ascii="Times New Roman" w:hAnsi="Times New Roman"/>
+                <w:b/>
+                <w:sz w:val="19"/>
+              </w:rPr>
+              <w:t>1,5</w:t>
+            </w:r>
+          </w:p>
+        </w:tc>
+        <w:tc>
+          <w:tcPr>
+            <w:tcW w:type="dxa" w:w="1179"/>
+          </w:tcPr>
+          <w:p>
+            <w:pPr>
+              <w:spacing w:before="0" w:after="0" w:line="240" w:lineRule="auto"/>
+              <w:ind w:firstLine="0"/>
+              <w:jc w:val="center"/>
+            </w:pPr>
+            <w:r>
+              <w:rPr>
+                <w:rFonts w:ascii="Times New Roman" w:hAnsi="Times New Roman"/>
+                <w:b/>
+                <w:sz w:val="19"/>
+              </w:rPr>
+              <w:t>1,9</w:t>
+            </w:r>
+          </w:p>
+        </w:tc>
+        <w:tc>
+          <w:tcPr>
+            <w:tcW w:type="dxa" w:w="1179"/>
+          </w:tcPr>
+          <w:p>
+            <w:pPr>
+              <w:spacing w:before="0" w:after="0" w:line="240" w:lineRule="auto"/>
+              <w:ind w:firstLine="0"/>
+              <w:jc w:val="center"/>
+            </w:pPr>
+            <w:r>
+              <w:rPr>
+                <w:rFonts w:ascii="Times New Roman" w:hAnsi="Times New Roman"/>
+                <w:b/>
+                <w:sz w:val="19"/>
+              </w:rPr>
+              <w:t>2,5</w:t>
+            </w:r>
+          </w:p>
+        </w:tc>
+      </w:tr>
+      <w:tr>
+        <w:tc>
+          <w:tcPr>
+            <w:tcW w:type="dxa" w:w="3368"/>
+          </w:tcPr>
+          <w:p>
+            <w:pPr>
+              <w:spacing w:before="0" w:after="0" w:line="240" w:lineRule="auto"/>
+              <w:ind w:firstLine="0"/>
+              <w:jc w:val="left"/>
+            </w:pPr>
+            <w:r>
+              <w:rPr>
+                <w:rFonts w:ascii="Times New Roman" w:hAnsi="Times New Roman"/>
+                <w:b/>
+                <w:color w:val="C00000"/>
+                <w:sz w:val="19"/>
+              </w:rPr>
+              <w:t xml:space="preserve">——●  </w:t>
+            </w:r>
+            <w:r>
+              <w:rPr>
+                <w:rFonts w:ascii="Times New Roman" w:hAnsi="Times New Roman"/>
+                <w:b/>
+                <w:sz w:val="19"/>
+              </w:rPr>
+              <w:t>Aloqabank: 3-bosqich (MHXS)</w:t>
+            </w:r>
+          </w:p>
+        </w:tc>
+        <w:tc>
+          <w:tcPr>
+            <w:tcW w:type="dxa" w:w="1179"/>
+          </w:tcPr>
+          <w:p>
+            <w:pPr>
+              <w:spacing w:before="0" w:after="0" w:line="240" w:lineRule="auto"/>
+              <w:ind w:firstLine="0"/>
+              <w:jc w:val="center"/>
+            </w:pPr>
+            <w:r>
+              <w:rPr>
+                <w:rFonts w:ascii="Times New Roman" w:hAnsi="Times New Roman"/>
+                <w:b/>
+                <w:sz w:val="19"/>
+              </w:rPr>
+              <w:t>10,0</w:t>
+            </w:r>
+          </w:p>
+        </w:tc>
+        <w:tc>
+          <w:tcPr>
+            <w:tcW w:type="dxa" w:w="1179"/>
+          </w:tcPr>
+          <w:p>
+            <w:pPr>
+              <w:spacing w:before="0" w:after="0" w:line="240" w:lineRule="auto"/>
+              <w:ind w:firstLine="0"/>
+              <w:jc w:val="center"/>
+            </w:pPr>
+            <w:r>
+              <w:rPr>
+                <w:rFonts w:ascii="Times New Roman" w:hAnsi="Times New Roman"/>
+                <w:b/>
+                <w:sz w:val="19"/>
+              </w:rPr>
+              <w:t>9,9</w:t>
+            </w:r>
+          </w:p>
+        </w:tc>
+        <w:tc>
+          <w:tcPr>
+            <w:tcW w:type="dxa" w:w="1179"/>
+          </w:tcPr>
+          <w:p>
+            <w:pPr>
+              <w:spacing w:before="0" w:after="0" w:line="240" w:lineRule="auto"/>
+              <w:ind w:firstLine="0"/>
+              <w:jc w:val="center"/>
+            </w:pPr>
+            <w:r>
+              <w:rPr>
+                <w:rFonts w:ascii="Times New Roman" w:hAnsi="Times New Roman"/>
+                <w:b/>
+                <w:sz w:val="19"/>
+              </w:rPr>
+              <w:t>6,1</w:t>
+            </w:r>
+          </w:p>
+        </w:tc>
+        <w:tc>
+          <w:tcPr>
+            <w:tcW w:type="dxa" w:w="1179"/>
+          </w:tcPr>
+          <w:p>
+            <w:pPr>
+              <w:spacing w:before="0" w:after="0" w:line="240" w:lineRule="auto"/>
+              <w:ind w:firstLine="0"/>
+              <w:jc w:val="center"/>
+            </w:pPr>
+            <w:r>
+              <w:rPr>
+                <w:rFonts w:ascii="Times New Roman" w:hAnsi="Times New Roman"/>
+                <w:b/>
+                <w:sz w:val="19"/>
+              </w:rPr>
+              <w:t>7,5</w:t>
+            </w:r>
+          </w:p>
+        </w:tc>
+        <w:tc>
+          <w:tcPr>
+            <w:tcW w:type="dxa" w:w="1179"/>
+          </w:tcPr>
+          <w:p>
+            <w:pPr>
+              <w:spacing w:before="0" w:after="0" w:line="240" w:lineRule="auto"/>
+              <w:ind w:firstLine="0"/>
+              <w:jc w:val="center"/>
+            </w:pPr>
+            <w:r>
+              <w:rPr>
+                <w:rFonts w:ascii="Times New Roman" w:hAnsi="Times New Roman"/>
+                <w:b/>
+                <w:sz w:val="19"/>
+              </w:rPr>
+              <w:t>7,2</w:t>
+            </w:r>
+          </w:p>
+        </w:tc>
+      </w:tr>
+    </w:tbl>
     <w:p>
       <w:pPr>
         <w:jc w:val="center"/>
@@ -48,7 +973,7 @@
           <w:i/>
           <w:sz w:val="22"/>
         </w:rPr>
-        <w:t>Namuna (ko‘rish uchun): chiziqli diagramma va ostida ma’lumotlar jadvali; uzuq chiziq – rasmiy muammoli kreditlar, to‘liq chiziq – MHXS 9 bo‘yicha 3-bosqich kreditlari. Aloqabank ma’lumotlari: muallif hisob-kitobi (prudensial shakllar va MHXS hisobotlari).</w:t>
+        <w:t>Namuna (ko‘rish uchun): uzuq chiziq – rasmiy muammoli kreditlar, to‘liq chiziq – MHXS 9 bo‘yicha 3-bosqich kreditlari. Aloqabank ma’lumotlari: muallif hisob-kitobi (prudensial shakllar va MHXS hisobotlari).</w:t>
       </w:r>
     </w:p>
     <w:sectPr>
@@ -23925,10 +24850,10 @@
           <c:layoutTarget val="inner"/>
           <c:xMode val="edge"/>
           <c:yMode val="edge"/>
-          <c:x val="0.3"/>
-          <c:y val="0.03"/>
-          <c:w val="0.68"/>
-          <c:h val="0.5"/>
+          <c:x val="0.36"/>
+          <c:y val="0.04"/>
+          <c:w val="0.63"/>
+          <c:h val="0.92"/>
         </c:manualLayout>
       </c:layout>
       <c:lineChart>
@@ -24443,7 +25368,7 @@
         <c:numFmt formatCode="General" sourceLinked="0"/>
         <c:majorTickMark val="none"/>
         <c:minorTickMark val="none"/>
-        <c:tickLblPos val="low"/>
+        <c:tickLblPos val="none"/>
         <c:spPr>
           <a:ln w="9525">
             <a:solidFill>
@@ -24525,36 +25450,6 @@
         <c:crossBetween val="between"/>
         <c:majorUnit val="4"/>
       </c:valAx>
-      <c:dTable>
-        <c:showHorzBorder val="1"/>
-        <c:showVertBorder val="1"/>
-        <c:showOutline val="1"/>
-        <c:showKeys val="1"/>
-        <c:spPr>
-          <a:noFill/>
-          <a:ln w="9525">
-            <a:solidFill>
-              <a:srgbClr val="7F7F7F"/>
-            </a:solidFill>
-          </a:ln>
-        </c:spPr>
-        <c:txPr>
-          <a:bodyPr/>
-          <a:lstStyle/>
-          <a:p>
-            <a:pPr>
-              <a:defRPr sz="1000" b="1">
-                <a:solidFill>
-                  <a:srgbClr val="000000"/>
-                </a:solidFill>
-                <a:latin typeface="Times New Roman"/>
-                <a:cs typeface="Times New Roman"/>
-              </a:defRPr>
-            </a:pPr>
-            <a:endParaRPr lang="uz-Latn-UZ"/>
-          </a:p>
-        </c:txPr>
-      </c:dTable>
       <c:spPr>
         <a:noFill/>
         <a:ln>

</xml_diff>

<commit_message>
2.2.7-rasm namunasi: jadvaldagi chiziq belgilari qalinlashtirildi
Co-Authored-By: Claude Opus 5.5 <noreply@anthropic.com>
Claude-Session: https://claude.ai/code/session_01PxHTC8Q7yHdrpAeUA5KUgM
</commit_message>
<xml_diff>
--- a/Namuna_2.2.7-rasm_Aloqabank.docx
+++ b/Namuna_2.2.7-rasm_Aloqabank.docx
@@ -35,20 +35,20 @@
         <w:tblLayout w:type="fixed"/>
         <w:tblLook w:firstColumn="1" w:firstRow="1" w:lastColumn="0" w:lastRow="0" w:noHBand="0" w:noVBand="1" w:val="04A0"/>
         <w:tblLayout w:type="fixed"/>
-        <w:tblW w:w="9263" w:type="dxa"/>
+        <w:tblW w:w="9260" w:type="dxa"/>
       </w:tblPr>
       <w:tblGrid>
-        <w:gridCol w:w="3368"/>
-        <w:gridCol w:w="1179"/>
-        <w:gridCol w:w="1179"/>
-        <w:gridCol w:w="1179"/>
-        <w:gridCol w:w="1179"/>
-        <w:gridCol w:w="1179"/>
+        <w:gridCol w:w="3555"/>
+        <w:gridCol w:w="1141"/>
+        <w:gridCol w:w="1141"/>
+        <w:gridCol w:w="1141"/>
+        <w:gridCol w:w="1141"/>
+        <w:gridCol w:w="1141"/>
       </w:tblGrid>
       <w:tr>
         <w:tc>
           <w:tcPr>
-            <w:tcW w:type="dxa" w:w="3368"/>
+            <w:tcW w:type="dxa" w:w="3555"/>
           </w:tcPr>
           <w:p>
             <w:pPr>
@@ -67,7 +67,7 @@
         </w:tc>
         <w:tc>
           <w:tcPr>
-            <w:tcW w:type="dxa" w:w="1179"/>
+            <w:tcW w:type="dxa" w:w="1141"/>
           </w:tcPr>
           <w:p>
             <w:pPr>
@@ -87,7 +87,7 @@
         </w:tc>
         <w:tc>
           <w:tcPr>
-            <w:tcW w:type="dxa" w:w="1179"/>
+            <w:tcW w:type="dxa" w:w="1141"/>
           </w:tcPr>
           <w:p>
             <w:pPr>
@@ -107,7 +107,7 @@
         </w:tc>
         <w:tc>
           <w:tcPr>
-            <w:tcW w:type="dxa" w:w="1179"/>
+            <w:tcW w:type="dxa" w:w="1141"/>
           </w:tcPr>
           <w:p>
             <w:pPr>
@@ -127,7 +127,7 @@
         </w:tc>
         <w:tc>
           <w:tcPr>
-            <w:tcW w:type="dxa" w:w="1179"/>
+            <w:tcW w:type="dxa" w:w="1141"/>
           </w:tcPr>
           <w:p>
             <w:pPr>
@@ -147,7 +147,7 @@
         </w:tc>
         <w:tc>
           <w:tcPr>
-            <w:tcW w:type="dxa" w:w="1179"/>
+            <w:tcW w:type="dxa" w:w="1141"/>
           </w:tcPr>
           <w:p>
             <w:pPr>
@@ -169,7 +169,7 @@
       <w:tr>
         <w:tc>
           <w:tcPr>
-            <w:tcW w:type="dxa" w:w="3368"/>
+            <w:tcW w:type="dxa" w:w="3555"/>
           </w:tcPr>
           <w:p>
             <w:pPr>
@@ -179,12 +179,11 @@
             </w:pPr>
             <w:r>
               <w:rPr>
-                <w:rFonts w:ascii="Times New Roman" w:hAnsi="Times New Roman"/>
                 <w:b/>
                 <w:color w:val="5B9BD5"/>
-                <w:sz w:val="19"/>
+                <w:sz w:val="26"/>
               </w:rPr>
-              <w:t xml:space="preserve">– – ●  </w:t>
+              <w:t xml:space="preserve">━ ━ ━ </w:t>
             </w:r>
             <w:r>
               <w:rPr>
@@ -198,7 +197,7 @@
         </w:tc>
         <w:tc>
           <w:tcPr>
-            <w:tcW w:type="dxa" w:w="1179"/>
+            <w:tcW w:type="dxa" w:w="1141"/>
           </w:tcPr>
           <w:p>
             <w:pPr>
@@ -218,7 +217,7 @@
         </w:tc>
         <w:tc>
           <w:tcPr>
-            <w:tcW w:type="dxa" w:w="1179"/>
+            <w:tcW w:type="dxa" w:w="1141"/>
           </w:tcPr>
           <w:p>
             <w:pPr>
@@ -238,7 +237,7 @@
         </w:tc>
         <w:tc>
           <w:tcPr>
-            <w:tcW w:type="dxa" w:w="1179"/>
+            <w:tcW w:type="dxa" w:w="1141"/>
           </w:tcPr>
           <w:p>
             <w:pPr>
@@ -258,7 +257,7 @@
         </w:tc>
         <w:tc>
           <w:tcPr>
-            <w:tcW w:type="dxa" w:w="1179"/>
+            <w:tcW w:type="dxa" w:w="1141"/>
           </w:tcPr>
           <w:p>
             <w:pPr>
@@ -278,7 +277,7 @@
         </w:tc>
         <w:tc>
           <w:tcPr>
-            <w:tcW w:type="dxa" w:w="1179"/>
+            <w:tcW w:type="dxa" w:w="1141"/>
           </w:tcPr>
           <w:p>
             <w:pPr>
@@ -300,7 +299,7 @@
       <w:tr>
         <w:tc>
           <w:tcPr>
-            <w:tcW w:type="dxa" w:w="3368"/>
+            <w:tcW w:type="dxa" w:w="3555"/>
           </w:tcPr>
           <w:p>
             <w:pPr>
@@ -310,12 +309,11 @@
             </w:pPr>
             <w:r>
               <w:rPr>
-                <w:rFonts w:ascii="Times New Roman" w:hAnsi="Times New Roman"/>
                 <w:b/>
                 <w:color w:val="1F4E79"/>
-                <w:sz w:val="19"/>
+                <w:sz w:val="26"/>
               </w:rPr>
-              <w:t xml:space="preserve">——●  </w:t>
+              <w:t xml:space="preserve">━━━━━ </w:t>
             </w:r>
             <w:r>
               <w:rPr>
@@ -329,7 +327,7 @@
         </w:tc>
         <w:tc>
           <w:tcPr>
-            <w:tcW w:type="dxa" w:w="1179"/>
+            <w:tcW w:type="dxa" w:w="1141"/>
           </w:tcPr>
           <w:p>
             <w:pPr>
@@ -349,7 +347,7 @@
         </w:tc>
         <w:tc>
           <w:tcPr>
-            <w:tcW w:type="dxa" w:w="1179"/>
+            <w:tcW w:type="dxa" w:w="1141"/>
           </w:tcPr>
           <w:p>
             <w:pPr>
@@ -369,7 +367,7 @@
         </w:tc>
         <w:tc>
           <w:tcPr>
-            <w:tcW w:type="dxa" w:w="1179"/>
+            <w:tcW w:type="dxa" w:w="1141"/>
           </w:tcPr>
           <w:p>
             <w:pPr>
@@ -389,7 +387,7 @@
         </w:tc>
         <w:tc>
           <w:tcPr>
-            <w:tcW w:type="dxa" w:w="1179"/>
+            <w:tcW w:type="dxa" w:w="1141"/>
           </w:tcPr>
           <w:p>
             <w:pPr>
@@ -409,7 +407,7 @@
         </w:tc>
         <w:tc>
           <w:tcPr>
-            <w:tcW w:type="dxa" w:w="1179"/>
+            <w:tcW w:type="dxa" w:w="1141"/>
           </w:tcPr>
           <w:p>
             <w:pPr>
@@ -431,7 +429,7 @@
       <w:tr>
         <w:tc>
           <w:tcPr>
-            <w:tcW w:type="dxa" w:w="3368"/>
+            <w:tcW w:type="dxa" w:w="3555"/>
           </w:tcPr>
           <w:p>
             <w:pPr>
@@ -441,12 +439,11 @@
             </w:pPr>
             <w:r>
               <w:rPr>
-                <w:rFonts w:ascii="Times New Roman" w:hAnsi="Times New Roman"/>
                 <w:b/>
                 <w:color w:val="70AD47"/>
-                <w:sz w:val="19"/>
+                <w:sz w:val="26"/>
               </w:rPr>
-              <w:t xml:space="preserve">– – ●  </w:t>
+              <w:t xml:space="preserve">━ ━ ━ </w:t>
             </w:r>
             <w:r>
               <w:rPr>
@@ -460,7 +457,7 @@
         </w:tc>
         <w:tc>
           <w:tcPr>
-            <w:tcW w:type="dxa" w:w="1179"/>
+            <w:tcW w:type="dxa" w:w="1141"/>
           </w:tcPr>
           <w:p>
             <w:pPr>
@@ -480,7 +477,7 @@
         </w:tc>
         <w:tc>
           <w:tcPr>
-            <w:tcW w:type="dxa" w:w="1179"/>
+            <w:tcW w:type="dxa" w:w="1141"/>
           </w:tcPr>
           <w:p>
             <w:pPr>
@@ -500,7 +497,7 @@
         </w:tc>
         <w:tc>
           <w:tcPr>
-            <w:tcW w:type="dxa" w:w="1179"/>
+            <w:tcW w:type="dxa" w:w="1141"/>
           </w:tcPr>
           <w:p>
             <w:pPr>
@@ -520,7 +517,7 @@
         </w:tc>
         <w:tc>
           <w:tcPr>
-            <w:tcW w:type="dxa" w:w="1179"/>
+            <w:tcW w:type="dxa" w:w="1141"/>
           </w:tcPr>
           <w:p>
             <w:pPr>
@@ -540,7 +537,7 @@
         </w:tc>
         <w:tc>
           <w:tcPr>
-            <w:tcW w:type="dxa" w:w="1179"/>
+            <w:tcW w:type="dxa" w:w="1141"/>
           </w:tcPr>
           <w:p>
             <w:pPr>
@@ -562,7 +559,7 @@
       <w:tr>
         <w:tc>
           <w:tcPr>
-            <w:tcW w:type="dxa" w:w="3368"/>
+            <w:tcW w:type="dxa" w:w="3555"/>
           </w:tcPr>
           <w:p>
             <w:pPr>
@@ -572,12 +569,11 @@
             </w:pPr>
             <w:r>
               <w:rPr>
-                <w:rFonts w:ascii="Times New Roman" w:hAnsi="Times New Roman"/>
                 <w:b/>
                 <w:color w:val="375623"/>
-                <w:sz w:val="19"/>
+                <w:sz w:val="26"/>
               </w:rPr>
-              <w:t xml:space="preserve">——●  </w:t>
+              <w:t xml:space="preserve">━━━━━ </w:t>
             </w:r>
             <w:r>
               <w:rPr>
@@ -591,7 +587,7 @@
         </w:tc>
         <w:tc>
           <w:tcPr>
-            <w:tcW w:type="dxa" w:w="1179"/>
+            <w:tcW w:type="dxa" w:w="1141"/>
           </w:tcPr>
           <w:p>
             <w:pPr>
@@ -611,7 +607,7 @@
         </w:tc>
         <w:tc>
           <w:tcPr>
-            <w:tcW w:type="dxa" w:w="1179"/>
+            <w:tcW w:type="dxa" w:w="1141"/>
           </w:tcPr>
           <w:p>
             <w:pPr>
@@ -631,7 +627,7 @@
         </w:tc>
         <w:tc>
           <w:tcPr>
-            <w:tcW w:type="dxa" w:w="1179"/>
+            <w:tcW w:type="dxa" w:w="1141"/>
           </w:tcPr>
           <w:p>
             <w:pPr>
@@ -651,7 +647,7 @@
         </w:tc>
         <w:tc>
           <w:tcPr>
-            <w:tcW w:type="dxa" w:w="1179"/>
+            <w:tcW w:type="dxa" w:w="1141"/>
           </w:tcPr>
           <w:p>
             <w:pPr>
@@ -671,7 +667,7 @@
         </w:tc>
         <w:tc>
           <w:tcPr>
-            <w:tcW w:type="dxa" w:w="1179"/>
+            <w:tcW w:type="dxa" w:w="1141"/>
           </w:tcPr>
           <w:p>
             <w:pPr>
@@ -693,7 +689,7 @@
       <w:tr>
         <w:tc>
           <w:tcPr>
-            <w:tcW w:type="dxa" w:w="3368"/>
+            <w:tcW w:type="dxa" w:w="3555"/>
           </w:tcPr>
           <w:p>
             <w:pPr>
@@ -703,12 +699,11 @@
             </w:pPr>
             <w:r>
               <w:rPr>
-                <w:rFonts w:ascii="Times New Roman" w:hAnsi="Times New Roman"/>
                 <w:b/>
                 <w:color w:val="ED7D31"/>
-                <w:sz w:val="19"/>
+                <w:sz w:val="26"/>
               </w:rPr>
-              <w:t xml:space="preserve">– – ●  </w:t>
+              <w:t xml:space="preserve">━ ━ ━ </w:t>
             </w:r>
             <w:r>
               <w:rPr>
@@ -722,7 +717,7 @@
         </w:tc>
         <w:tc>
           <w:tcPr>
-            <w:tcW w:type="dxa" w:w="1179"/>
+            <w:tcW w:type="dxa" w:w="1141"/>
           </w:tcPr>
           <w:p>
             <w:pPr>
@@ -742,7 +737,7 @@
         </w:tc>
         <w:tc>
           <w:tcPr>
-            <w:tcW w:type="dxa" w:w="1179"/>
+            <w:tcW w:type="dxa" w:w="1141"/>
           </w:tcPr>
           <w:p>
             <w:pPr>
@@ -762,7 +757,7 @@
         </w:tc>
         <w:tc>
           <w:tcPr>
-            <w:tcW w:type="dxa" w:w="1179"/>
+            <w:tcW w:type="dxa" w:w="1141"/>
           </w:tcPr>
           <w:p>
             <w:pPr>
@@ -782,7 +777,7 @@
         </w:tc>
         <w:tc>
           <w:tcPr>
-            <w:tcW w:type="dxa" w:w="1179"/>
+            <w:tcW w:type="dxa" w:w="1141"/>
           </w:tcPr>
           <w:p>
             <w:pPr>
@@ -802,7 +797,7 @@
         </w:tc>
         <w:tc>
           <w:tcPr>
-            <w:tcW w:type="dxa" w:w="1179"/>
+            <w:tcW w:type="dxa" w:w="1141"/>
           </w:tcPr>
           <w:p>
             <w:pPr>
@@ -824,7 +819,7 @@
       <w:tr>
         <w:tc>
           <w:tcPr>
-            <w:tcW w:type="dxa" w:w="3368"/>
+            <w:tcW w:type="dxa" w:w="3555"/>
           </w:tcPr>
           <w:p>
             <w:pPr>
@@ -834,12 +829,11 @@
             </w:pPr>
             <w:r>
               <w:rPr>
-                <w:rFonts w:ascii="Times New Roman" w:hAnsi="Times New Roman"/>
                 <w:b/>
                 <w:color w:val="C00000"/>
-                <w:sz w:val="19"/>
+                <w:sz w:val="26"/>
               </w:rPr>
-              <w:t xml:space="preserve">——●  </w:t>
+              <w:t xml:space="preserve">━━━━━ </w:t>
             </w:r>
             <w:r>
               <w:rPr>
@@ -853,7 +847,7 @@
         </w:tc>
         <w:tc>
           <w:tcPr>
-            <w:tcW w:type="dxa" w:w="1179"/>
+            <w:tcW w:type="dxa" w:w="1141"/>
           </w:tcPr>
           <w:p>
             <w:pPr>
@@ -873,7 +867,7 @@
         </w:tc>
         <w:tc>
           <w:tcPr>
-            <w:tcW w:type="dxa" w:w="1179"/>
+            <w:tcW w:type="dxa" w:w="1141"/>
           </w:tcPr>
           <w:p>
             <w:pPr>
@@ -893,7 +887,7 @@
         </w:tc>
         <w:tc>
           <w:tcPr>
-            <w:tcW w:type="dxa" w:w="1179"/>
+            <w:tcW w:type="dxa" w:w="1141"/>
           </w:tcPr>
           <w:p>
             <w:pPr>
@@ -913,7 +907,7 @@
         </w:tc>
         <w:tc>
           <w:tcPr>
-            <w:tcW w:type="dxa" w:w="1179"/>
+            <w:tcW w:type="dxa" w:w="1141"/>
           </w:tcPr>
           <w:p>
             <w:pPr>
@@ -933,7 +927,7 @@
         </w:tc>
         <w:tc>
           <w:tcPr>
-            <w:tcW w:type="dxa" w:w="1179"/>
+            <w:tcW w:type="dxa" w:w="1141"/>
           </w:tcPr>
           <w:p>
             <w:pPr>
@@ -24850,9 +24844,9 @@
           <c:layoutTarget val="inner"/>
           <c:xMode val="edge"/>
           <c:yMode val="edge"/>
-          <c:x val="0.36"/>
+          <c:x val="0.38"/>
           <c:y val="0.04"/>
-          <c:w val="0.63"/>
+          <c:w val="0.61"/>
           <c:h val="0.92"/>
         </c:manualLayout>
       </c:layout>

</xml_diff>

<commit_message>
2.2.7-rasm dissertatsiyada yangi shaklga almashtirildi (chiziqli diagramma + jadval, Aloqabank bilan), tahlilga jumla qo'shildi
Co-Authored-By: Claude Opus 5.5 <noreply@anthropic.com>
Claude-Session: https://claude.ai/code/session_01PxHTC8Q7yHdrpAeUA5KUgM
</commit_message>
<xml_diff>
--- a/Namuna_2.2.7-rasm_Aloqabank.docx
+++ b/Namuna_2.2.7-rasm_Aloqabank.docx
@@ -53,7 +53,7 @@
           <w:p>
             <w:pPr>
               <w:spacing w:before="0" w:after="0" w:line="240" w:lineRule="auto"/>
-              <w:ind w:firstLine="0"/>
+              <w:ind w:firstLine="0" w:left="0" w:right="0"/>
               <w:jc w:val="left"/>
             </w:pPr>
             <w:r>
@@ -72,7 +72,7 @@
           <w:p>
             <w:pPr>
               <w:spacing w:before="0" w:after="0" w:line="240" w:lineRule="auto"/>
-              <w:ind w:firstLine="0"/>
+              <w:ind w:firstLine="0" w:left="0" w:right="0"/>
               <w:jc w:val="center"/>
             </w:pPr>
             <w:r>
@@ -92,7 +92,7 @@
           <w:p>
             <w:pPr>
               <w:spacing w:before="0" w:after="0" w:line="240" w:lineRule="auto"/>
-              <w:ind w:firstLine="0"/>
+              <w:ind w:firstLine="0" w:left="0" w:right="0"/>
               <w:jc w:val="center"/>
             </w:pPr>
             <w:r>
@@ -112,7 +112,7 @@
           <w:p>
             <w:pPr>
               <w:spacing w:before="0" w:after="0" w:line="240" w:lineRule="auto"/>
-              <w:ind w:firstLine="0"/>
+              <w:ind w:firstLine="0" w:left="0" w:right="0"/>
               <w:jc w:val="center"/>
             </w:pPr>
             <w:r>
@@ -132,7 +132,7 @@
           <w:p>
             <w:pPr>
               <w:spacing w:before="0" w:after="0" w:line="240" w:lineRule="auto"/>
-              <w:ind w:firstLine="0"/>
+              <w:ind w:firstLine="0" w:left="0" w:right="0"/>
               <w:jc w:val="center"/>
             </w:pPr>
             <w:r>
@@ -152,7 +152,7 @@
           <w:p>
             <w:pPr>
               <w:spacing w:before="0" w:after="0" w:line="240" w:lineRule="auto"/>
-              <w:ind w:firstLine="0"/>
+              <w:ind w:firstLine="0" w:left="0" w:right="0"/>
               <w:jc w:val="center"/>
             </w:pPr>
             <w:r>
@@ -174,7 +174,7 @@
           <w:p>
             <w:pPr>
               <w:spacing w:before="0" w:after="0" w:line="240" w:lineRule="auto"/>
-              <w:ind w:firstLine="0"/>
+              <w:ind w:firstLine="0" w:left="0" w:right="0"/>
               <w:jc w:val="left"/>
             </w:pPr>
             <w:r>
@@ -183,7 +183,7 @@
                 <w:color w:val="5B9BD5"/>
                 <w:sz w:val="26"/>
               </w:rPr>
-              <w:t xml:space="preserve">━ ━ ━ </w:t>
+              <w:t xml:space="preserve">━ ━ </w:t>
             </w:r>
             <w:r>
               <w:rPr>
@@ -202,7 +202,7 @@
           <w:p>
             <w:pPr>
               <w:spacing w:before="0" w:after="0" w:line="240" w:lineRule="auto"/>
-              <w:ind w:firstLine="0"/>
+              <w:ind w:firstLine="0" w:left="0" w:right="0"/>
               <w:jc w:val="center"/>
             </w:pPr>
             <w:r>
@@ -222,7 +222,7 @@
           <w:p>
             <w:pPr>
               <w:spacing w:before="0" w:after="0" w:line="240" w:lineRule="auto"/>
-              <w:ind w:firstLine="0"/>
+              <w:ind w:firstLine="0" w:left="0" w:right="0"/>
               <w:jc w:val="center"/>
             </w:pPr>
             <w:r>
@@ -242,7 +242,7 @@
           <w:p>
             <w:pPr>
               <w:spacing w:before="0" w:after="0" w:line="240" w:lineRule="auto"/>
-              <w:ind w:firstLine="0"/>
+              <w:ind w:firstLine="0" w:left="0" w:right="0"/>
               <w:jc w:val="center"/>
             </w:pPr>
             <w:r>
@@ -262,7 +262,7 @@
           <w:p>
             <w:pPr>
               <w:spacing w:before="0" w:after="0" w:line="240" w:lineRule="auto"/>
-              <w:ind w:firstLine="0"/>
+              <w:ind w:firstLine="0" w:left="0" w:right="0"/>
               <w:jc w:val="center"/>
             </w:pPr>
             <w:r>
@@ -282,7 +282,7 @@
           <w:p>
             <w:pPr>
               <w:spacing w:before="0" w:after="0" w:line="240" w:lineRule="auto"/>
-              <w:ind w:firstLine="0"/>
+              <w:ind w:firstLine="0" w:left="0" w:right="0"/>
               <w:jc w:val="center"/>
             </w:pPr>
             <w:r>
@@ -304,7 +304,7 @@
           <w:p>
             <w:pPr>
               <w:spacing w:before="0" w:after="0" w:line="240" w:lineRule="auto"/>
-              <w:ind w:firstLine="0"/>
+              <w:ind w:firstLine="0" w:left="0" w:right="0"/>
               <w:jc w:val="left"/>
             </w:pPr>
             <w:r>
@@ -313,7 +313,7 @@
                 <w:color w:val="1F4E79"/>
                 <w:sz w:val="26"/>
               </w:rPr>
-              <w:t xml:space="preserve">━━━━━ </w:t>
+              <w:t xml:space="preserve">━━━ </w:t>
             </w:r>
             <w:r>
               <w:rPr>
@@ -332,7 +332,7 @@
           <w:p>
             <w:pPr>
               <w:spacing w:before="0" w:after="0" w:line="240" w:lineRule="auto"/>
-              <w:ind w:firstLine="0"/>
+              <w:ind w:firstLine="0" w:left="0" w:right="0"/>
               <w:jc w:val="center"/>
             </w:pPr>
             <w:r>
@@ -352,7 +352,7 @@
           <w:p>
             <w:pPr>
               <w:spacing w:before="0" w:after="0" w:line="240" w:lineRule="auto"/>
-              <w:ind w:firstLine="0"/>
+              <w:ind w:firstLine="0" w:left="0" w:right="0"/>
               <w:jc w:val="center"/>
             </w:pPr>
             <w:r>
@@ -372,7 +372,7 @@
           <w:p>
             <w:pPr>
               <w:spacing w:before="0" w:after="0" w:line="240" w:lineRule="auto"/>
-              <w:ind w:firstLine="0"/>
+              <w:ind w:firstLine="0" w:left="0" w:right="0"/>
               <w:jc w:val="center"/>
             </w:pPr>
             <w:r>
@@ -392,7 +392,7 @@
           <w:p>
             <w:pPr>
               <w:spacing w:before="0" w:after="0" w:line="240" w:lineRule="auto"/>
-              <w:ind w:firstLine="0"/>
+              <w:ind w:firstLine="0" w:left="0" w:right="0"/>
               <w:jc w:val="center"/>
             </w:pPr>
             <w:r>
@@ -412,7 +412,7 @@
           <w:p>
             <w:pPr>
               <w:spacing w:before="0" w:after="0" w:line="240" w:lineRule="auto"/>
-              <w:ind w:firstLine="0"/>
+              <w:ind w:firstLine="0" w:left="0" w:right="0"/>
               <w:jc w:val="center"/>
             </w:pPr>
             <w:r>
@@ -434,7 +434,7 @@
           <w:p>
             <w:pPr>
               <w:spacing w:before="0" w:after="0" w:line="240" w:lineRule="auto"/>
-              <w:ind w:firstLine="0"/>
+              <w:ind w:firstLine="0" w:left="0" w:right="0"/>
               <w:jc w:val="left"/>
             </w:pPr>
             <w:r>
@@ -443,7 +443,7 @@
                 <w:color w:val="70AD47"/>
                 <w:sz w:val="26"/>
               </w:rPr>
-              <w:t xml:space="preserve">━ ━ ━ </w:t>
+              <w:t xml:space="preserve">━ ━ </w:t>
             </w:r>
             <w:r>
               <w:rPr>
@@ -462,7 +462,7 @@
           <w:p>
             <w:pPr>
               <w:spacing w:before="0" w:after="0" w:line="240" w:lineRule="auto"/>
-              <w:ind w:firstLine="0"/>
+              <w:ind w:firstLine="0" w:left="0" w:right="0"/>
               <w:jc w:val="center"/>
             </w:pPr>
             <w:r>
@@ -482,7 +482,7 @@
           <w:p>
             <w:pPr>
               <w:spacing w:before="0" w:after="0" w:line="240" w:lineRule="auto"/>
-              <w:ind w:firstLine="0"/>
+              <w:ind w:firstLine="0" w:left="0" w:right="0"/>
               <w:jc w:val="center"/>
             </w:pPr>
             <w:r>
@@ -502,7 +502,7 @@
           <w:p>
             <w:pPr>
               <w:spacing w:before="0" w:after="0" w:line="240" w:lineRule="auto"/>
-              <w:ind w:firstLine="0"/>
+              <w:ind w:firstLine="0" w:left="0" w:right="0"/>
               <w:jc w:val="center"/>
             </w:pPr>
             <w:r>
@@ -522,7 +522,7 @@
           <w:p>
             <w:pPr>
               <w:spacing w:before="0" w:after="0" w:line="240" w:lineRule="auto"/>
-              <w:ind w:firstLine="0"/>
+              <w:ind w:firstLine="0" w:left="0" w:right="0"/>
               <w:jc w:val="center"/>
             </w:pPr>
             <w:r>
@@ -542,7 +542,7 @@
           <w:p>
             <w:pPr>
               <w:spacing w:before="0" w:after="0" w:line="240" w:lineRule="auto"/>
-              <w:ind w:firstLine="0"/>
+              <w:ind w:firstLine="0" w:left="0" w:right="0"/>
               <w:jc w:val="center"/>
             </w:pPr>
             <w:r>
@@ -564,7 +564,7 @@
           <w:p>
             <w:pPr>
               <w:spacing w:before="0" w:after="0" w:line="240" w:lineRule="auto"/>
-              <w:ind w:firstLine="0"/>
+              <w:ind w:firstLine="0" w:left="0" w:right="0"/>
               <w:jc w:val="left"/>
             </w:pPr>
             <w:r>
@@ -573,7 +573,7 @@
                 <w:color w:val="375623"/>
                 <w:sz w:val="26"/>
               </w:rPr>
-              <w:t xml:space="preserve">━━━━━ </w:t>
+              <w:t xml:space="preserve">━━━ </w:t>
             </w:r>
             <w:r>
               <w:rPr>
@@ -592,7 +592,7 @@
           <w:p>
             <w:pPr>
               <w:spacing w:before="0" w:after="0" w:line="240" w:lineRule="auto"/>
-              <w:ind w:firstLine="0"/>
+              <w:ind w:firstLine="0" w:left="0" w:right="0"/>
               <w:jc w:val="center"/>
             </w:pPr>
             <w:r>
@@ -612,7 +612,7 @@
           <w:p>
             <w:pPr>
               <w:spacing w:before="0" w:after="0" w:line="240" w:lineRule="auto"/>
-              <w:ind w:firstLine="0"/>
+              <w:ind w:firstLine="0" w:left="0" w:right="0"/>
               <w:jc w:val="center"/>
             </w:pPr>
             <w:r>
@@ -632,7 +632,7 @@
           <w:p>
             <w:pPr>
               <w:spacing w:before="0" w:after="0" w:line="240" w:lineRule="auto"/>
-              <w:ind w:firstLine="0"/>
+              <w:ind w:firstLine="0" w:left="0" w:right="0"/>
               <w:jc w:val="center"/>
             </w:pPr>
             <w:r>
@@ -652,7 +652,7 @@
           <w:p>
             <w:pPr>
               <w:spacing w:before="0" w:after="0" w:line="240" w:lineRule="auto"/>
-              <w:ind w:firstLine="0"/>
+              <w:ind w:firstLine="0" w:left="0" w:right="0"/>
               <w:jc w:val="center"/>
             </w:pPr>
             <w:r>
@@ -672,7 +672,7 @@
           <w:p>
             <w:pPr>
               <w:spacing w:before="0" w:after="0" w:line="240" w:lineRule="auto"/>
-              <w:ind w:firstLine="0"/>
+              <w:ind w:firstLine="0" w:left="0" w:right="0"/>
               <w:jc w:val="center"/>
             </w:pPr>
             <w:r>
@@ -694,7 +694,7 @@
           <w:p>
             <w:pPr>
               <w:spacing w:before="0" w:after="0" w:line="240" w:lineRule="auto"/>
-              <w:ind w:firstLine="0"/>
+              <w:ind w:firstLine="0" w:left="0" w:right="0"/>
               <w:jc w:val="left"/>
             </w:pPr>
             <w:r>
@@ -703,7 +703,7 @@
                 <w:color w:val="ED7D31"/>
                 <w:sz w:val="26"/>
               </w:rPr>
-              <w:t xml:space="preserve">━ ━ ━ </w:t>
+              <w:t xml:space="preserve">━ ━ </w:t>
             </w:r>
             <w:r>
               <w:rPr>
@@ -722,7 +722,7 @@
           <w:p>
             <w:pPr>
               <w:spacing w:before="0" w:after="0" w:line="240" w:lineRule="auto"/>
-              <w:ind w:firstLine="0"/>
+              <w:ind w:firstLine="0" w:left="0" w:right="0"/>
               <w:jc w:val="center"/>
             </w:pPr>
             <w:r>
@@ -742,7 +742,7 @@
           <w:p>
             <w:pPr>
               <w:spacing w:before="0" w:after="0" w:line="240" w:lineRule="auto"/>
-              <w:ind w:firstLine="0"/>
+              <w:ind w:firstLine="0" w:left="0" w:right="0"/>
               <w:jc w:val="center"/>
             </w:pPr>
             <w:r>
@@ -762,7 +762,7 @@
           <w:p>
             <w:pPr>
               <w:spacing w:before="0" w:after="0" w:line="240" w:lineRule="auto"/>
-              <w:ind w:firstLine="0"/>
+              <w:ind w:firstLine="0" w:left="0" w:right="0"/>
               <w:jc w:val="center"/>
             </w:pPr>
             <w:r>
@@ -782,7 +782,7 @@
           <w:p>
             <w:pPr>
               <w:spacing w:before="0" w:after="0" w:line="240" w:lineRule="auto"/>
-              <w:ind w:firstLine="0"/>
+              <w:ind w:firstLine="0" w:left="0" w:right="0"/>
               <w:jc w:val="center"/>
             </w:pPr>
             <w:r>
@@ -802,7 +802,7 @@
           <w:p>
             <w:pPr>
               <w:spacing w:before="0" w:after="0" w:line="240" w:lineRule="auto"/>
-              <w:ind w:firstLine="0"/>
+              <w:ind w:firstLine="0" w:left="0" w:right="0"/>
               <w:jc w:val="center"/>
             </w:pPr>
             <w:r>
@@ -824,7 +824,7 @@
           <w:p>
             <w:pPr>
               <w:spacing w:before="0" w:after="0" w:line="240" w:lineRule="auto"/>
-              <w:ind w:firstLine="0"/>
+              <w:ind w:firstLine="0" w:left="0" w:right="0"/>
               <w:jc w:val="left"/>
             </w:pPr>
             <w:r>
@@ -833,7 +833,7 @@
                 <w:color w:val="C00000"/>
                 <w:sz w:val="26"/>
               </w:rPr>
-              <w:t xml:space="preserve">━━━━━ </w:t>
+              <w:t xml:space="preserve">━━━ </w:t>
             </w:r>
             <w:r>
               <w:rPr>
@@ -852,7 +852,7 @@
           <w:p>
             <w:pPr>
               <w:spacing w:before="0" w:after="0" w:line="240" w:lineRule="auto"/>
-              <w:ind w:firstLine="0"/>
+              <w:ind w:firstLine="0" w:left="0" w:right="0"/>
               <w:jc w:val="center"/>
             </w:pPr>
             <w:r>
@@ -872,7 +872,7 @@
           <w:p>
             <w:pPr>
               <w:spacing w:before="0" w:after="0" w:line="240" w:lineRule="auto"/>
-              <w:ind w:firstLine="0"/>
+              <w:ind w:firstLine="0" w:left="0" w:right="0"/>
               <w:jc w:val="center"/>
             </w:pPr>
             <w:r>
@@ -892,7 +892,7 @@
           <w:p>
             <w:pPr>
               <w:spacing w:before="0" w:after="0" w:line="240" w:lineRule="auto"/>
-              <w:ind w:firstLine="0"/>
+              <w:ind w:firstLine="0" w:left="0" w:right="0"/>
               <w:jc w:val="center"/>
             </w:pPr>
             <w:r>
@@ -912,7 +912,7 @@
           <w:p>
             <w:pPr>
               <w:spacing w:before="0" w:after="0" w:line="240" w:lineRule="auto"/>
-              <w:ind w:firstLine="0"/>
+              <w:ind w:firstLine="0" w:left="0" w:right="0"/>
               <w:jc w:val="center"/>
             </w:pPr>
             <w:r>
@@ -932,7 +932,7 @@
           <w:p>
             <w:pPr>
               <w:spacing w:before="0" w:after="0" w:line="240" w:lineRule="auto"/>
-              <w:ind w:firstLine="0"/>
+              <w:ind w:firstLine="0" w:left="0" w:right="0"/>
               <w:jc w:val="center"/>
             </w:pPr>
             <w:r>

</xml_diff>